<commit_message>
changed the recommendation system , added the activities.json
</commit_message>
<xml_diff>
--- a/readme.docx
+++ b/readme.docx
@@ -595,7 +595,7 @@
           <w:rFonts w:ascii="Times New Roman" w:hAnsi="Times New Roman" w:cs="Times New Roman"/>
         </w:rPr>
         <w:pict w14:anchorId="6997AFF7">
-          <v:rect id="_x0000_i1310" style="width:0;height:1.5pt" o:hralign="center" o:hrstd="t" o:hr="t" fillcolor="#a0a0a0" stroked="f"/>
+          <v:rect id="_x0000_i1025" style="width:0;height:1.5pt" o:hralign="center" o:hrstd="t" o:hr="t" fillcolor="#a0a0a0" stroked="f"/>
         </w:pict>
       </w:r>
     </w:p>
@@ -690,7 +690,7 @@
           <w:rFonts w:ascii="Times New Roman" w:hAnsi="Times New Roman" w:cs="Times New Roman"/>
         </w:rPr>
         <w:pict w14:anchorId="7B468433">
-          <v:rect id="_x0000_i1311" style="width:0;height:1.5pt" o:hralign="center" o:hrstd="t" o:hr="t" fillcolor="#a0a0a0" stroked="f"/>
+          <v:rect id="_x0000_i1026" style="width:0;height:1.5pt" o:hralign="center" o:hrstd="t" o:hr="t" fillcolor="#a0a0a0" stroked="f"/>
         </w:pict>
       </w:r>
     </w:p>
@@ -1001,7 +1001,7 @@
           <w:rFonts w:ascii="Times New Roman" w:hAnsi="Times New Roman" w:cs="Times New Roman"/>
         </w:rPr>
         <w:pict w14:anchorId="5B4A80D4">
-          <v:rect id="_x0000_i1312" style="width:0;height:1.5pt" o:hralign="center" o:hrstd="t" o:hr="t" fillcolor="#a0a0a0" stroked="f"/>
+          <v:rect id="_x0000_i1027" style="width:0;height:1.5pt" o:hralign="center" o:hrstd="t" o:hr="t" fillcolor="#a0a0a0" stroked="f"/>
         </w:pict>
       </w:r>
     </w:p>
@@ -1542,7 +1542,7 @@
           <w:rFonts w:ascii="Times New Roman" w:hAnsi="Times New Roman" w:cs="Times New Roman"/>
         </w:rPr>
         <w:pict w14:anchorId="543D18DC">
-          <v:rect id="_x0000_i1313" style="width:0;height:1.5pt" o:hralign="center" o:hrstd="t" o:hr="t" fillcolor="#a0a0a0" stroked="f"/>
+          <v:rect id="_x0000_i1028" style="width:0;height:1.5pt" o:hralign="center" o:hrstd="t" o:hr="t" fillcolor="#a0a0a0" stroked="f"/>
         </w:pict>
       </w:r>
     </w:p>
@@ -1787,7 +1787,7 @@
           <w:rFonts w:ascii="Times New Roman" w:hAnsi="Times New Roman" w:cs="Times New Roman"/>
         </w:rPr>
         <w:pict w14:anchorId="46EF9394">
-          <v:rect id="_x0000_i1314" style="width:0;height:1.5pt" o:hralign="center" o:hrstd="t" o:hr="t" fillcolor="#a0a0a0" stroked="f"/>
+          <v:rect id="_x0000_i1029" style="width:0;height:1.5pt" o:hralign="center" o:hrstd="t" o:hr="t" fillcolor="#a0a0a0" stroked="f"/>
         </w:pict>
       </w:r>
     </w:p>
@@ -2209,7 +2209,7 @@
           <w:rFonts w:ascii="Times New Roman" w:hAnsi="Times New Roman" w:cs="Times New Roman"/>
         </w:rPr>
         <w:pict w14:anchorId="6FFD5E91">
-          <v:rect id="_x0000_i1315" style="width:0;height:1.5pt" o:hralign="center" o:hrstd="t" o:hr="t" fillcolor="#a0a0a0" stroked="f"/>
+          <v:rect id="_x0000_i1030" style="width:0;height:1.5pt" o:hralign="center" o:hrstd="t" o:hr="t" fillcolor="#a0a0a0" stroked="f"/>
         </w:pict>
       </w:r>
     </w:p>
@@ -2473,9 +2473,15 @@
         <w:rPr>
           <w:rFonts w:ascii="Times New Roman" w:hAnsi="Times New Roman" w:cs="Times New Roman"/>
         </w:rPr>
-        <w:t>chatbot_model.keras</w:t>
+        <w:t>saved_model</w:t>
       </w:r>
       <w:proofErr w:type="spellEnd"/>
+      <w:r>
+        <w:rPr>
+          <w:rFonts w:ascii="Times New Roman" w:hAnsi="Times New Roman" w:cs="Times New Roman"/>
+        </w:rPr>
+        <w:t>/</w:t>
+      </w:r>
     </w:p>
     <w:p>
       <w:pPr>
@@ -2549,7 +2555,7 @@
           <w:rFonts w:ascii="Times New Roman" w:hAnsi="Times New Roman" w:cs="Times New Roman"/>
         </w:rPr>
         <w:pict w14:anchorId="6621DDA7">
-          <v:rect id="_x0000_i1316" style="width:0;height:1.5pt" o:hralign="center" o:hrstd="t" o:hr="t" fillcolor="#a0a0a0" stroked="f"/>
+          <v:rect id="_x0000_i1031" style="width:0;height:1.5pt" o:hralign="center" o:hrstd="t" o:hr="t" fillcolor="#a0a0a0" stroked="f"/>
         </w:pict>
       </w:r>
     </w:p>
@@ -2835,7 +2841,7 @@
           <w:rFonts w:ascii="Times New Roman" w:hAnsi="Times New Roman" w:cs="Times New Roman"/>
         </w:rPr>
         <w:pict w14:anchorId="3C414EF9">
-          <v:rect id="_x0000_i1317" style="width:0;height:1.5pt" o:hralign="center" o:hrstd="t" o:hr="t" fillcolor="#a0a0a0" stroked="f"/>
+          <v:rect id="_x0000_i1032" style="width:0;height:1.5pt" o:hralign="center" o:hrstd="t" o:hr="t" fillcolor="#a0a0a0" stroked="f"/>
         </w:pict>
       </w:r>
     </w:p>
@@ -3217,7 +3223,7 @@
           <w:rFonts w:ascii="Times New Roman" w:hAnsi="Times New Roman" w:cs="Times New Roman"/>
         </w:rPr>
         <w:pict w14:anchorId="307F713D">
-          <v:rect id="_x0000_i1318" style="width:0;height:1.5pt" o:hralign="center" o:hrstd="t" o:hr="t" fillcolor="#a0a0a0" stroked="f"/>
+          <v:rect id="_x0000_i1033" style="width:0;height:1.5pt" o:hralign="center" o:hrstd="t" o:hr="t" fillcolor="#a0a0a0" stroked="f"/>
         </w:pict>
       </w:r>
     </w:p>
@@ -3548,7 +3554,7 @@
           <w:rFonts w:ascii="Times New Roman" w:hAnsi="Times New Roman" w:cs="Times New Roman"/>
         </w:rPr>
         <w:pict w14:anchorId="2427EF47">
-          <v:rect id="_x0000_i1319" style="width:0;height:1.5pt" o:hralign="center" o:hrstd="t" o:hr="t" fillcolor="#a0a0a0" stroked="f"/>
+          <v:rect id="_x0000_i1034" style="width:0;height:1.5pt" o:hralign="center" o:hrstd="t" o:hr="t" fillcolor="#a0a0a0" stroked="f"/>
         </w:pict>
       </w:r>
     </w:p>
@@ -3886,7 +3892,7 @@
           <w:rFonts w:ascii="Times New Roman" w:hAnsi="Times New Roman" w:cs="Times New Roman"/>
         </w:rPr>
         <w:pict w14:anchorId="2B134086">
-          <v:rect id="_x0000_i1320" style="width:0;height:1.5pt" o:hralign="center" o:hrstd="t" o:hr="t" fillcolor="#a0a0a0" stroked="f"/>
+          <v:rect id="_x0000_i1035" style="width:0;height:1.5pt" o:hralign="center" o:hrstd="t" o:hr="t" fillcolor="#a0a0a0" stroked="f"/>
         </w:pict>
       </w:r>
     </w:p>
@@ -4009,7 +4015,7 @@
           <w:rFonts w:ascii="Times New Roman" w:hAnsi="Times New Roman" w:cs="Times New Roman"/>
         </w:rPr>
         <w:pict w14:anchorId="1C9F2455">
-          <v:rect id="_x0000_i1321" style="width:0;height:1.5pt" o:hralign="center" o:hrstd="t" o:hr="t" fillcolor="#a0a0a0" stroked="f"/>
+          <v:rect id="_x0000_i1036" style="width:0;height:1.5pt" o:hralign="center" o:hrstd="t" o:hr="t" fillcolor="#a0a0a0" stroked="f"/>
         </w:pict>
       </w:r>
     </w:p>
@@ -4244,7 +4250,7 @@
           <w:rFonts w:ascii="Times New Roman" w:hAnsi="Times New Roman" w:cs="Times New Roman"/>
         </w:rPr>
         <w:pict w14:anchorId="20418794">
-          <v:rect id="_x0000_i1322" style="width:0;height:1.5pt" o:hralign="center" o:hrstd="t" o:hr="t" fillcolor="#a0a0a0" stroked="f"/>
+          <v:rect id="_x0000_i1037" style="width:0;height:1.5pt" o:hralign="center" o:hrstd="t" o:hr="t" fillcolor="#a0a0a0" stroked="f"/>
         </w:pict>
       </w:r>
     </w:p>
@@ -4530,7 +4536,262 @@
           <w:rFonts w:ascii="Times New Roman" w:hAnsi="Times New Roman" w:cs="Times New Roman"/>
           <w:color w:val="FFFFFF" w:themeColor="background1"/>
         </w:rPr>
-        <w:t>chatbot_</w:t>
+        <w:t>saved_model</w:t>
+      </w:r>
+      <w:proofErr w:type="spellEnd"/>
+      <w:r>
+        <w:rPr>
+          <w:rFonts w:ascii="Times New Roman" w:hAnsi="Times New Roman" w:cs="Times New Roman"/>
+          <w:color w:val="FFFFFF" w:themeColor="background1"/>
+        </w:rPr>
+        <w:t>/</w:t>
+      </w:r>
+      <w:r>
+        <w:rPr>
+          <w:rFonts w:ascii="Times New Roman" w:hAnsi="Times New Roman" w:cs="Times New Roman"/>
+          <w:color w:val="FFFFFF" w:themeColor="background1"/>
+        </w:rPr>
+        <w:br/>
+      </w:r>
+      <w:r>
+        <w:rPr>
+          <w:rFonts w:ascii="Times New Roman" w:eastAsia="MS Gothic" w:hAnsi="Times New Roman" w:cs="Times New Roman"/>
+          <w:color w:val="FFFFFF" w:themeColor="background1"/>
+        </w:rPr>
+        <w:t>├</w:t>
+      </w:r>
+      <w:r>
+        <w:rPr>
+          <w:rFonts w:ascii="Times New Roman" w:hAnsi="Times New Roman" w:cs="Times New Roman"/>
+          <w:color w:val="FFFFFF" w:themeColor="background1"/>
+        </w:rPr>
+        <w:t xml:space="preserve">── </w:t>
+      </w:r>
+      <w:proofErr w:type="spellStart"/>
+      <w:r>
+        <w:rPr>
+          <w:rFonts w:ascii="Times New Roman" w:hAnsi="Times New Roman" w:cs="Times New Roman"/>
+          <w:color w:val="FFFFFF" w:themeColor="background1"/>
+        </w:rPr>
+        <w:t>classes.pkl</w:t>
+      </w:r>
+      <w:proofErr w:type="spellEnd"/>
+      <w:r>
+        <w:rPr>
+          <w:rFonts w:ascii="Times New Roman" w:hAnsi="Times New Roman" w:cs="Times New Roman"/>
+          <w:color w:val="FFFFFF" w:themeColor="background1"/>
+        </w:rPr>
+        <w:br/>
+      </w:r>
+      <w:r>
+        <w:rPr>
+          <w:rFonts w:ascii="Times New Roman" w:eastAsia="MS Gothic" w:hAnsi="Times New Roman" w:cs="Times New Roman"/>
+          <w:color w:val="FFFFFF" w:themeColor="background1"/>
+        </w:rPr>
+        <w:t>├</w:t>
+      </w:r>
+      <w:r>
+        <w:rPr>
+          <w:rFonts w:ascii="Times New Roman" w:hAnsi="Times New Roman" w:cs="Times New Roman"/>
+          <w:color w:val="FFFFFF" w:themeColor="background1"/>
+        </w:rPr>
+        <w:t xml:space="preserve">── </w:t>
+      </w:r>
+      <w:proofErr w:type="spellStart"/>
+      <w:r>
+        <w:rPr>
+          <w:rFonts w:ascii="Times New Roman" w:hAnsi="Times New Roman" w:cs="Times New Roman"/>
+          <w:color w:val="FFFFFF" w:themeColor="background1"/>
+        </w:rPr>
+        <w:t>words.pkl</w:t>
+      </w:r>
+      <w:proofErr w:type="spellEnd"/>
+    </w:p>
+    <w:p>
+      <w:pPr>
+        <w:shd w:val="clear" w:color="auto" w:fill="404040" w:themeFill="text1" w:themeFillTint="BF"/>
+        <w:spacing w:line="240" w:lineRule="auto"/>
+        <w:rPr>
+          <w:rFonts w:ascii="Times New Roman" w:hAnsi="Times New Roman" w:cs="Times New Roman"/>
+          <w:color w:val="FFFFFF" w:themeColor="background1"/>
+        </w:rPr>
+      </w:pPr>
+      <w:r>
+        <w:rPr>
+          <w:rFonts w:ascii="Times New Roman" w:hAnsi="Times New Roman" w:cs="Times New Roman"/>
+          <w:color w:val="FFFFFF" w:themeColor="background1"/>
+        </w:rPr>
+        <w:t>services/</w:t>
+      </w:r>
+      <w:r>
+        <w:rPr>
+          <w:rFonts w:ascii="Times New Roman" w:hAnsi="Times New Roman" w:cs="Times New Roman"/>
+          <w:color w:val="FFFFFF" w:themeColor="background1"/>
+        </w:rPr>
+        <w:br/>
+      </w:r>
+      <w:r>
+        <w:rPr>
+          <w:rFonts w:ascii="Times New Roman" w:eastAsia="MS Gothic" w:hAnsi="Times New Roman" w:cs="Times New Roman"/>
+          <w:color w:val="FFFFFF" w:themeColor="background1"/>
+        </w:rPr>
+        <w:t>├</w:t>
+      </w:r>
+      <w:r>
+        <w:rPr>
+          <w:rFonts w:ascii="Times New Roman" w:hAnsi="Times New Roman" w:cs="Times New Roman"/>
+          <w:color w:val="FFFFFF" w:themeColor="background1"/>
+        </w:rPr>
+        <w:t>── order_service.py</w:t>
+      </w:r>
+      <w:r>
+        <w:rPr>
+          <w:rFonts w:ascii="Times New Roman" w:hAnsi="Times New Roman" w:cs="Times New Roman"/>
+          <w:color w:val="FFFFFF" w:themeColor="background1"/>
+        </w:rPr>
+        <w:br/>
+      </w:r>
+      <w:r>
+        <w:rPr>
+          <w:rFonts w:ascii="Times New Roman" w:eastAsia="MS Gothic" w:hAnsi="Times New Roman" w:cs="Times New Roman"/>
+          <w:color w:val="FFFFFF" w:themeColor="background1"/>
+        </w:rPr>
+        <w:t>├</w:t>
+      </w:r>
+      <w:r>
+        <w:rPr>
+          <w:rFonts w:ascii="Times New Roman" w:hAnsi="Times New Roman" w:cs="Times New Roman"/>
+          <w:color w:val="FFFFFF" w:themeColor="background1"/>
+        </w:rPr>
+        <w:t>── recommendation_service.py</w:t>
+      </w:r>
+    </w:p>
+    <w:p>
+      <w:pPr>
+        <w:shd w:val="clear" w:color="auto" w:fill="404040" w:themeFill="text1" w:themeFillTint="BF"/>
+        <w:spacing w:line="240" w:lineRule="auto"/>
+        <w:rPr>
+          <w:rFonts w:ascii="Times New Roman" w:hAnsi="Times New Roman" w:cs="Times New Roman"/>
+          <w:color w:val="FFFFFF" w:themeColor="background1"/>
+        </w:rPr>
+      </w:pPr>
+      <w:r>
+        <w:rPr>
+          <w:rFonts w:ascii="Times New Roman" w:hAnsi="Times New Roman" w:cs="Times New Roman"/>
+          <w:color w:val="FFFFFF" w:themeColor="background1"/>
+        </w:rPr>
+        <w:t>static/</w:t>
+      </w:r>
+      <w:r>
+        <w:rPr>
+          <w:rFonts w:ascii="Times New Roman" w:hAnsi="Times New Roman" w:cs="Times New Roman"/>
+          <w:color w:val="FFFFFF" w:themeColor="background1"/>
+        </w:rPr>
+        <w:br/>
+      </w:r>
+      <w:r>
+        <w:rPr>
+          <w:rFonts w:ascii="Times New Roman" w:eastAsia="MS Gothic" w:hAnsi="Times New Roman" w:cs="Times New Roman"/>
+          <w:color w:val="FFFFFF" w:themeColor="background1"/>
+        </w:rPr>
+        <w:t>├</w:t>
+      </w:r>
+      <w:r>
+        <w:rPr>
+          <w:rFonts w:ascii="Times New Roman" w:hAnsi="Times New Roman" w:cs="Times New Roman"/>
+          <w:color w:val="FFFFFF" w:themeColor="background1"/>
+        </w:rPr>
+        <w:t>── style.css</w:t>
+      </w:r>
+    </w:p>
+    <w:p>
+      <w:pPr>
+        <w:shd w:val="clear" w:color="auto" w:fill="404040" w:themeFill="text1" w:themeFillTint="BF"/>
+        <w:spacing w:line="240" w:lineRule="auto"/>
+        <w:rPr>
+          <w:rFonts w:ascii="Times New Roman" w:hAnsi="Times New Roman" w:cs="Times New Roman"/>
+          <w:color w:val="FFFFFF" w:themeColor="background1"/>
+        </w:rPr>
+      </w:pPr>
+      <w:r>
+        <w:rPr>
+          <w:rFonts w:ascii="Times New Roman" w:hAnsi="Times New Roman" w:cs="Times New Roman"/>
+          <w:color w:val="FFFFFF" w:themeColor="background1"/>
+        </w:rPr>
+        <w:t>templates/</w:t>
+      </w:r>
+      <w:r>
+        <w:rPr>
+          <w:rFonts w:ascii="Times New Roman" w:hAnsi="Times New Roman" w:cs="Times New Roman"/>
+          <w:color w:val="FFFFFF" w:themeColor="background1"/>
+        </w:rPr>
+        <w:br/>
+      </w:r>
+      <w:r>
+        <w:rPr>
+          <w:rFonts w:ascii="Times New Roman" w:eastAsia="MS Gothic" w:hAnsi="Times New Roman" w:cs="Times New Roman"/>
+          <w:color w:val="FFFFFF" w:themeColor="background1"/>
+        </w:rPr>
+        <w:t>├</w:t>
+      </w:r>
+      <w:r>
+        <w:rPr>
+          <w:rFonts w:ascii="Times New Roman" w:hAnsi="Times New Roman" w:cs="Times New Roman"/>
+          <w:color w:val="FFFFFF" w:themeColor="background1"/>
+        </w:rPr>
+        <w:t>── index.html</w:t>
+      </w:r>
+    </w:p>
+    <w:p>
+      <w:pPr>
+        <w:shd w:val="clear" w:color="auto" w:fill="404040" w:themeFill="text1" w:themeFillTint="BF"/>
+        <w:spacing w:line="240" w:lineRule="auto"/>
+        <w:rPr>
+          <w:rFonts w:ascii="Times New Roman" w:hAnsi="Times New Roman" w:cs="Times New Roman"/>
+          <w:color w:val="FFFFFF" w:themeColor="background1"/>
+        </w:rPr>
+      </w:pPr>
+      <w:r>
+        <w:rPr>
+          <w:rFonts w:ascii="Times New Roman" w:hAnsi="Times New Roman" w:cs="Times New Roman"/>
+          <w:color w:val="FFFFFF" w:themeColor="background1"/>
+        </w:rPr>
+        <w:t>app.py</w:t>
+      </w:r>
+    </w:p>
+    <w:p>
+      <w:pPr>
+        <w:shd w:val="clear" w:color="auto" w:fill="404040" w:themeFill="text1" w:themeFillTint="BF"/>
+        <w:spacing w:line="240" w:lineRule="auto"/>
+        <w:rPr>
+          <w:rFonts w:ascii="Times New Roman" w:hAnsi="Times New Roman" w:cs="Times New Roman"/>
+          <w:color w:val="FFFFFF" w:themeColor="background1"/>
+        </w:rPr>
+      </w:pPr>
+      <w:r>
+        <w:rPr>
+          <w:rFonts w:ascii="Times New Roman" w:hAnsi="Times New Roman" w:cs="Times New Roman"/>
+          <w:color w:val="FFFFFF" w:themeColor="background1"/>
+        </w:rPr>
+        <w:t>requirements.txt</w:t>
+      </w:r>
+    </w:p>
+    <w:p>
+      <w:pPr>
+        <w:shd w:val="clear" w:color="auto" w:fill="404040" w:themeFill="text1" w:themeFillTint="BF"/>
+        <w:spacing w:line="240" w:lineRule="auto"/>
+        <w:rPr>
+          <w:rFonts w:ascii="Times New Roman" w:hAnsi="Times New Roman" w:cs="Times New Roman"/>
+          <w:color w:val="FFFFFF" w:themeColor="background1"/>
+        </w:rPr>
+      </w:pPr>
+      <w:proofErr w:type="spellStart"/>
+      <w:r>
+        <w:rPr>
+          <w:rFonts w:ascii="Times New Roman" w:hAnsi="Times New Roman" w:cs="Times New Roman"/>
+          <w:color w:val="FFFFFF" w:themeColor="background1"/>
+        </w:rPr>
+        <w:t>training_</w:t>
       </w:r>
       <w:proofErr w:type="gramStart"/>
       <w:r>
@@ -4538,282 +4799,25 @@
           <w:rFonts w:ascii="Times New Roman" w:hAnsi="Times New Roman" w:cs="Times New Roman"/>
           <w:color w:val="FFFFFF" w:themeColor="background1"/>
         </w:rPr>
-        <w:t>model.keras</w:t>
+        <w:t>model.ipynb</w:t>
       </w:r>
       <w:proofErr w:type="spellEnd"/>
       <w:proofErr w:type="gramEnd"/>
-      <w:r>
+    </w:p>
+    <w:p>
+      <w:pPr>
+        <w:shd w:val="clear" w:color="auto" w:fill="404040" w:themeFill="text1" w:themeFillTint="BF"/>
+        <w:spacing w:line="240" w:lineRule="auto"/>
         <w:rPr>
           <w:rFonts w:ascii="Times New Roman" w:hAnsi="Times New Roman" w:cs="Times New Roman"/>
           <w:color w:val="FFFFFF" w:themeColor="background1"/>
         </w:rPr>
-        <w:br/>
-      </w:r>
-      <w:r>
-        <w:rPr>
-          <w:rFonts w:ascii="Times New Roman" w:eastAsia="MS Gothic" w:hAnsi="Times New Roman" w:cs="Times New Roman"/>
+      </w:pPr>
+      <w:r>
+        <w:rPr>
+          <w:rFonts w:ascii="Times New Roman" w:hAnsi="Times New Roman" w:cs="Times New Roman"/>
           <w:color w:val="FFFFFF" w:themeColor="background1"/>
         </w:rPr>
-        <w:t>├</w:t>
-      </w:r>
-      <w:r>
-        <w:rPr>
-          <w:rFonts w:ascii="Times New Roman" w:hAnsi="Times New Roman" w:cs="Times New Roman"/>
-          <w:color w:val="FFFFFF" w:themeColor="background1"/>
-        </w:rPr>
-        <w:t xml:space="preserve">── </w:t>
-      </w:r>
-      <w:proofErr w:type="spellStart"/>
-      <w:r>
-        <w:rPr>
-          <w:rFonts w:ascii="Times New Roman" w:hAnsi="Times New Roman" w:cs="Times New Roman"/>
-          <w:color w:val="FFFFFF" w:themeColor="background1"/>
-        </w:rPr>
-        <w:t>classes.pkl</w:t>
-      </w:r>
-      <w:proofErr w:type="spellEnd"/>
-      <w:r>
-        <w:rPr>
-          <w:rFonts w:ascii="Times New Roman" w:hAnsi="Times New Roman" w:cs="Times New Roman"/>
-          <w:color w:val="FFFFFF" w:themeColor="background1"/>
-        </w:rPr>
-        <w:br/>
-      </w:r>
-      <w:r>
-        <w:rPr>
-          <w:rFonts w:ascii="Times New Roman" w:eastAsia="MS Gothic" w:hAnsi="Times New Roman" w:cs="Times New Roman"/>
-          <w:color w:val="FFFFFF" w:themeColor="background1"/>
-        </w:rPr>
-        <w:t>├</w:t>
-      </w:r>
-      <w:r>
-        <w:rPr>
-          <w:rFonts w:ascii="Times New Roman" w:hAnsi="Times New Roman" w:cs="Times New Roman"/>
-          <w:color w:val="FFFFFF" w:themeColor="background1"/>
-        </w:rPr>
-        <w:t xml:space="preserve">── </w:t>
-      </w:r>
-      <w:proofErr w:type="spellStart"/>
-      <w:r>
-        <w:rPr>
-          <w:rFonts w:ascii="Times New Roman" w:hAnsi="Times New Roman" w:cs="Times New Roman"/>
-          <w:color w:val="FFFFFF" w:themeColor="background1"/>
-        </w:rPr>
-        <w:t>words.pkl</w:t>
-      </w:r>
-      <w:proofErr w:type="spellEnd"/>
-    </w:p>
-    <w:p>
-      <w:pPr>
-        <w:shd w:val="clear" w:color="auto" w:fill="404040" w:themeFill="text1" w:themeFillTint="BF"/>
-        <w:spacing w:line="240" w:lineRule="auto"/>
-        <w:rPr>
-          <w:rFonts w:ascii="Times New Roman" w:hAnsi="Times New Roman" w:cs="Times New Roman"/>
-          <w:color w:val="FFFFFF" w:themeColor="background1"/>
-        </w:rPr>
-      </w:pPr>
-      <w:r>
-        <w:rPr>
-          <w:rFonts w:ascii="Times New Roman" w:hAnsi="Times New Roman" w:cs="Times New Roman"/>
-          <w:color w:val="FFFFFF" w:themeColor="background1"/>
-        </w:rPr>
-        <w:t>services/</w:t>
-      </w:r>
-      <w:r>
-        <w:rPr>
-          <w:rFonts w:ascii="Times New Roman" w:hAnsi="Times New Roman" w:cs="Times New Roman"/>
-          <w:color w:val="FFFFFF" w:themeColor="background1"/>
-        </w:rPr>
-        <w:br/>
-      </w:r>
-      <w:r>
-        <w:rPr>
-          <w:rFonts w:ascii="Times New Roman" w:eastAsia="MS Gothic" w:hAnsi="Times New Roman" w:cs="Times New Roman"/>
-          <w:color w:val="FFFFFF" w:themeColor="background1"/>
-        </w:rPr>
-        <w:t>├</w:t>
-      </w:r>
-      <w:r>
-        <w:rPr>
-          <w:rFonts w:ascii="Times New Roman" w:hAnsi="Times New Roman" w:cs="Times New Roman"/>
-          <w:color w:val="FFFFFF" w:themeColor="background1"/>
-        </w:rPr>
-        <w:t>── order_service.py</w:t>
-      </w:r>
-      <w:r>
-        <w:rPr>
-          <w:rFonts w:ascii="Times New Roman" w:hAnsi="Times New Roman" w:cs="Times New Roman"/>
-          <w:color w:val="FFFFFF" w:themeColor="background1"/>
-        </w:rPr>
-        <w:br/>
-      </w:r>
-      <w:r>
-        <w:rPr>
-          <w:rFonts w:ascii="Times New Roman" w:eastAsia="MS Gothic" w:hAnsi="Times New Roman" w:cs="Times New Roman"/>
-          <w:color w:val="FFFFFF" w:themeColor="background1"/>
-        </w:rPr>
-        <w:t>├</w:t>
-      </w:r>
-      <w:r>
-        <w:rPr>
-          <w:rFonts w:ascii="Times New Roman" w:hAnsi="Times New Roman" w:cs="Times New Roman"/>
-          <w:color w:val="FFFFFF" w:themeColor="background1"/>
-        </w:rPr>
-        <w:t>── recommendation_service.py</w:t>
-      </w:r>
-    </w:p>
-    <w:p>
-      <w:pPr>
-        <w:shd w:val="clear" w:color="auto" w:fill="404040" w:themeFill="text1" w:themeFillTint="BF"/>
-        <w:spacing w:line="240" w:lineRule="auto"/>
-        <w:rPr>
-          <w:rFonts w:ascii="Times New Roman" w:hAnsi="Times New Roman" w:cs="Times New Roman"/>
-          <w:color w:val="FFFFFF" w:themeColor="background1"/>
-        </w:rPr>
-      </w:pPr>
-      <w:r>
-        <w:rPr>
-          <w:rFonts w:ascii="Times New Roman" w:hAnsi="Times New Roman" w:cs="Times New Roman"/>
-          <w:color w:val="FFFFFF" w:themeColor="background1"/>
-        </w:rPr>
-        <w:t>static/</w:t>
-      </w:r>
-      <w:r>
-        <w:rPr>
-          <w:rFonts w:ascii="Times New Roman" w:hAnsi="Times New Roman" w:cs="Times New Roman"/>
-          <w:color w:val="FFFFFF" w:themeColor="background1"/>
-        </w:rPr>
-        <w:br/>
-      </w:r>
-      <w:r>
-        <w:rPr>
-          <w:rFonts w:ascii="Times New Roman" w:eastAsia="MS Gothic" w:hAnsi="Times New Roman" w:cs="Times New Roman"/>
-          <w:color w:val="FFFFFF" w:themeColor="background1"/>
-        </w:rPr>
-        <w:t>├</w:t>
-      </w:r>
-      <w:r>
-        <w:rPr>
-          <w:rFonts w:ascii="Times New Roman" w:hAnsi="Times New Roman" w:cs="Times New Roman"/>
-          <w:color w:val="FFFFFF" w:themeColor="background1"/>
-        </w:rPr>
-        <w:t>── style.css</w:t>
-      </w:r>
-    </w:p>
-    <w:p>
-      <w:pPr>
-        <w:shd w:val="clear" w:color="auto" w:fill="404040" w:themeFill="text1" w:themeFillTint="BF"/>
-        <w:spacing w:line="240" w:lineRule="auto"/>
-        <w:rPr>
-          <w:rFonts w:ascii="Times New Roman" w:hAnsi="Times New Roman" w:cs="Times New Roman"/>
-          <w:color w:val="FFFFFF" w:themeColor="background1"/>
-        </w:rPr>
-      </w:pPr>
-      <w:r>
-        <w:rPr>
-          <w:rFonts w:ascii="Times New Roman" w:hAnsi="Times New Roman" w:cs="Times New Roman"/>
-          <w:color w:val="FFFFFF" w:themeColor="background1"/>
-        </w:rPr>
-        <w:t>templates/</w:t>
-      </w:r>
-      <w:r>
-        <w:rPr>
-          <w:rFonts w:ascii="Times New Roman" w:hAnsi="Times New Roman" w:cs="Times New Roman"/>
-          <w:color w:val="FFFFFF" w:themeColor="background1"/>
-        </w:rPr>
-        <w:br/>
-      </w:r>
-      <w:r>
-        <w:rPr>
-          <w:rFonts w:ascii="Times New Roman" w:eastAsia="MS Gothic" w:hAnsi="Times New Roman" w:cs="Times New Roman"/>
-          <w:color w:val="FFFFFF" w:themeColor="background1"/>
-        </w:rPr>
-        <w:t>├</w:t>
-      </w:r>
-      <w:r>
-        <w:rPr>
-          <w:rFonts w:ascii="Times New Roman" w:hAnsi="Times New Roman" w:cs="Times New Roman"/>
-          <w:color w:val="FFFFFF" w:themeColor="background1"/>
-        </w:rPr>
-        <w:t>── index.html</w:t>
-      </w:r>
-    </w:p>
-    <w:p>
-      <w:pPr>
-        <w:shd w:val="clear" w:color="auto" w:fill="404040" w:themeFill="text1" w:themeFillTint="BF"/>
-        <w:spacing w:line="240" w:lineRule="auto"/>
-        <w:rPr>
-          <w:rFonts w:ascii="Times New Roman" w:hAnsi="Times New Roman" w:cs="Times New Roman"/>
-          <w:color w:val="FFFFFF" w:themeColor="background1"/>
-        </w:rPr>
-      </w:pPr>
-      <w:r>
-        <w:rPr>
-          <w:rFonts w:ascii="Times New Roman" w:hAnsi="Times New Roman" w:cs="Times New Roman"/>
-          <w:color w:val="FFFFFF" w:themeColor="background1"/>
-        </w:rPr>
-        <w:t>app.py</w:t>
-      </w:r>
-    </w:p>
-    <w:p>
-      <w:pPr>
-        <w:shd w:val="clear" w:color="auto" w:fill="404040" w:themeFill="text1" w:themeFillTint="BF"/>
-        <w:spacing w:line="240" w:lineRule="auto"/>
-        <w:rPr>
-          <w:rFonts w:ascii="Times New Roman" w:hAnsi="Times New Roman" w:cs="Times New Roman"/>
-          <w:color w:val="FFFFFF" w:themeColor="background1"/>
-        </w:rPr>
-      </w:pPr>
-      <w:r>
-        <w:rPr>
-          <w:rFonts w:ascii="Times New Roman" w:hAnsi="Times New Roman" w:cs="Times New Roman"/>
-          <w:color w:val="FFFFFF" w:themeColor="background1"/>
-        </w:rPr>
-        <w:t>requirements.txt</w:t>
-      </w:r>
-    </w:p>
-    <w:p>
-      <w:pPr>
-        <w:shd w:val="clear" w:color="auto" w:fill="404040" w:themeFill="text1" w:themeFillTint="BF"/>
-        <w:spacing w:line="240" w:lineRule="auto"/>
-        <w:rPr>
-          <w:rFonts w:ascii="Times New Roman" w:hAnsi="Times New Roman" w:cs="Times New Roman"/>
-          <w:color w:val="FFFFFF" w:themeColor="background1"/>
-        </w:rPr>
-      </w:pPr>
-      <w:proofErr w:type="spellStart"/>
-      <w:r>
-        <w:rPr>
-          <w:rFonts w:ascii="Times New Roman" w:hAnsi="Times New Roman" w:cs="Times New Roman"/>
-          <w:color w:val="FFFFFF" w:themeColor="background1"/>
-        </w:rPr>
-        <w:t>training_</w:t>
-      </w:r>
-      <w:proofErr w:type="gramStart"/>
-      <w:r>
-        <w:rPr>
-          <w:rFonts w:ascii="Times New Roman" w:hAnsi="Times New Roman" w:cs="Times New Roman"/>
-          <w:color w:val="FFFFFF" w:themeColor="background1"/>
-        </w:rPr>
-        <w:t>model.ipynb</w:t>
-      </w:r>
-      <w:proofErr w:type="spellEnd"/>
-      <w:proofErr w:type="gramEnd"/>
-    </w:p>
-    <w:p>
-      <w:pPr>
-        <w:shd w:val="clear" w:color="auto" w:fill="404040" w:themeFill="text1" w:themeFillTint="BF"/>
-        <w:spacing w:line="240" w:lineRule="auto"/>
-        <w:rPr>
-          <w:rFonts w:ascii="Times New Roman" w:hAnsi="Times New Roman" w:cs="Times New Roman"/>
-          <w:color w:val="FFFFFF" w:themeColor="background1"/>
-        </w:rPr>
-      </w:pPr>
-      <w:r>
-        <w:rPr>
-          <w:rFonts w:ascii="Times New Roman" w:hAnsi="Times New Roman" w:cs="Times New Roman"/>
-          <w:color w:val="FFFFFF" w:themeColor="background1"/>
-        </w:rPr>
         <w:t>README.md</w:t>
       </w:r>
     </w:p>
@@ -4829,7 +4833,7 @@
           <w:rFonts w:ascii="Times New Roman" w:hAnsi="Times New Roman" w:cs="Times New Roman"/>
         </w:rPr>
         <w:pict w14:anchorId="0CFB032C">
-          <v:rect id="_x0000_i1323" style="width:0;height:1.5pt" o:hralign="center" o:hrstd="t" o:hr="t" fillcolor="#a0a0a0" stroked="f"/>
+          <v:rect id="_x0000_i1038" style="width:0;height:1.5pt" o:hralign="center" o:hrstd="t" o:hr="t" fillcolor="#a0a0a0" stroked="f"/>
         </w:pict>
       </w:r>
     </w:p>

</xml_diff>